<commit_message>
Follow the textbook on three more RHM exam answers
Phục Hình K47 câu 50 and the pit-and-fissure caries question (Sâu Răng
K40 câu 40, K43 câu 55) now use the answer the textbook states verbatim,
with the circled option kept as a note.

Co-Authored-By: Claude Opus 5.5 <noreply@anthropic.com>
</commit_message>
<xml_diff>
--- a/Đề thi Phục Hình Tháo Lắp RHM/RHM K47.docx
+++ b/Đề thi Phục Hình Tháo Lắp RHM/RHM K47.docx
@@ -4203,7 +4203,7 @@
         <w:rPr>
           <w:b/>
         </w:rPr>
-        <w:t>Đáp án: D</w:t>
+        <w:t>Đáp án: A (AI làm đáp án — đề gốc khoanh D. Tất cả đều đúng)</w:t>
       </w:r>
     </w:p>
     <w:p>
@@ -4214,7 +4214,7 @@
         <w:t xml:space="preserve">Ghi chú: </w:t>
       </w:r>
       <w:r>
-        <w:t>Giáo trình PHTL (Bài 7, mục 2.5–2.7): cưa đế mẫu hàm làm nhiều miếng nhỏ, dùng dao tách dần hàm giả khỏi thạch cao, dùng búa gỗ gõ để tách khối thạch cao khỏi múp. Đề khoanh D (có dấu hỏi bên cạnh).</w:t>
+        <w:t>Giáo trình PHTL (Bài 7, mục 2.7): gỡ hàm nhựa ra khỏi mẫu hàm bằng cách cưa đế mẫu hàm làm nhiều miếng nhỏ, lấy từ từ thạch cao. Búa gỗ chỉ dùng để tách múp và gõ khối thạch cao ra khỏi múp (mục 2.5), không dùng gõ cho mẫu hàm bể — nên D "Tất cả đều đúng" không khớp giáo trình.</w:t>
       </w:r>
     </w:p>
     <w:p>

</xml_diff>